<commit_message>
fix(acpos): complete visual anchor preview review contracts
</commit_message>
<xml_diff>
--- a/ACPOS_ERP-01_ERP與財務_Mother_Basic_Design_OPTIMIZED.docx
+++ b/ACPOS_ERP-01_ERP與財務_Mother_Basic_Design_OPTIMIZED.docx
@@ -29839,6 +29839,441 @@
           <w:p>
             <w:r>
               <w:t>Detect overlap, clipping, horizontal overflow, unapproved scroll, control compression, unexpected wrap/stack, aspect drift, misalignment, sticky/fixed occlusion and header/sidebar/workspace collision.</w:t>
+            </w:r>
+          </w:p>
+        </w:tc>
+      </w:tr>
+    </w:tbl>
+    <w:p>
+      <w:pPr>
+        <w:pStyle w:val="Heading2"/>
+      </w:pPr>
+      <w:r>
+        <w:t>Visual Anchor / Preview / Review Contract｜視覺錨點與預覽審查補齊</w:t>
+      </w:r>
+    </w:p>
+    <w:p>
+      <w:r>
+        <w:t>[ACPOS-DESIGN-CLOSURE:ERP-01:VISUAL]</w:t>
+      </w:r>
+    </w:p>
+    <w:tbl>
+      <w:tblPr>
+        <w:tblStyle w:val="TableGrid"/>
+        <w:tblW w:type="auto" w:w="0"/>
+        <w:tblLook w:firstColumn="1" w:firstRow="1" w:lastColumn="0" w:lastRow="0" w:noHBand="0" w:noVBand="1" w:val="04A0"/>
+      </w:tblPr>
+      <w:tblGrid>
+        <w:gridCol w:w="3206"/>
+        <w:gridCol w:w="3206"/>
+        <w:gridCol w:w="3206"/>
+        <w:gridCol w:w="3206"/>
+        <w:gridCol w:w="3206"/>
+      </w:tblGrid>
+      <w:tr>
+        <w:tc>
+          <w:tcPr>
+            <w:tcW w:type="dxa" w:w="3206"/>
+          </w:tcPr>
+          <w:p>
+            <w:r>
+              <w:t>Anchor UID</w:t>
+            </w:r>
+          </w:p>
+        </w:tc>
+        <w:tc>
+          <w:tcPr>
+            <w:tcW w:type="dxa" w:w="3206"/>
+          </w:tcPr>
+          <w:p>
+            <w:r>
+              <w:t>Position Rule</w:t>
+            </w:r>
+          </w:p>
+        </w:tc>
+        <w:tc>
+          <w:tcPr>
+            <w:tcW w:type="dxa" w:w="3206"/>
+          </w:tcPr>
+          <w:p>
+            <w:r>
+              <w:t>Dimension Rule</w:t>
+            </w:r>
+          </w:p>
+        </w:tc>
+        <w:tc>
+          <w:tcPr>
+            <w:tcW w:type="dxa" w:w="3206"/>
+          </w:tcPr>
+          <w:p>
+            <w:r>
+              <w:t>Relationship Rule</w:t>
+            </w:r>
+          </w:p>
+        </w:tc>
+        <w:tc>
+          <w:tcPr>
+            <w:tcW w:type="dxa" w:w="3206"/>
+          </w:tcPr>
+          <w:p>
+            <w:r>
+              <w:t>Lock Status</w:t>
+            </w:r>
+          </w:p>
+        </w:tc>
+      </w:tr>
+      <w:tr>
+        <w:tc>
+          <w:tcPr>
+            <w:tcW w:type="dxa" w:w="3206"/>
+          </w:tcPr>
+          <w:p>
+            <w:r>
+              <w:t>ERP-01-VA-HEADER</w:t>
+            </w:r>
+          </w:p>
+        </w:tc>
+        <w:tc>
+          <w:tcPr>
+            <w:tcW w:type="dxa" w:w="3206"/>
+          </w:tcPr>
+          <w:p>
+            <w:r>
+              <w:t>Fixed at top of shared shell</w:t>
+            </w:r>
+          </w:p>
+        </w:tc>
+        <w:tc>
+          <w:tcPr>
+            <w:tcW w:type="dxa" w:w="3206"/>
+          </w:tcPr>
+          <w:p>
+            <w:r>
+              <w:t>58px full-width according to current shell authority</w:t>
+            </w:r>
+          </w:p>
+        </w:tc>
+        <w:tc>
+          <w:tcPr>
+            <w:tcW w:type="dxa" w:w="3206"/>
+          </w:tcPr>
+          <w:p>
+            <w:r>
+              <w:t>Above Sidebar/Workspace; must not be covered by page content</w:t>
+            </w:r>
+          </w:p>
+        </w:tc>
+        <w:tc>
+          <w:tcPr>
+            <w:tcW w:type="dxa" w:w="3206"/>
+          </w:tcPr>
+          <w:p>
+            <w:r>
+              <w:t>LOCKED</w:t>
+            </w:r>
+          </w:p>
+        </w:tc>
+      </w:tr>
+      <w:tr>
+        <w:tc>
+          <w:tcPr>
+            <w:tcW w:type="dxa" w:w="3206"/>
+          </w:tcPr>
+          <w:p>
+            <w:r>
+              <w:t>ERP-01-VA-SIDEBAR</w:t>
+            </w:r>
+          </w:p>
+        </w:tc>
+        <w:tc>
+          <w:tcPr>
+            <w:tcW w:type="dxa" w:w="3206"/>
+          </w:tcPr>
+          <w:p>
+            <w:r>
+              <w:t>Fixed left rail under shared shell header</w:t>
+            </w:r>
+          </w:p>
+        </w:tc>
+        <w:tc>
+          <w:tcPr>
+            <w:tcW w:type="dxa" w:w="3206"/>
+          </w:tcPr>
+          <w:p>
+            <w:r>
+              <w:t>64px resting; 221px overlay expansion where current shell defines it</w:t>
+            </w:r>
+          </w:p>
+        </w:tc>
+        <w:tc>
+          <w:tcPr>
+            <w:tcW w:type="dxa" w:w="3206"/>
+          </w:tcPr>
+          <w:p>
+            <w:r>
+              <w:t>Overlay expansion must not silently change the approved page Primary Grid</w:t>
+            </w:r>
+          </w:p>
+        </w:tc>
+        <w:tc>
+          <w:tcPr>
+            <w:tcW w:type="dxa" w:w="3206"/>
+          </w:tcPr>
+          <w:p>
+            <w:r>
+              <w:t>LOCKED</w:t>
+            </w:r>
+          </w:p>
+        </w:tc>
+      </w:tr>
+      <w:tr>
+        <w:tc>
+          <w:tcPr>
+            <w:tcW w:type="dxa" w:w="3206"/>
+          </w:tcPr>
+          <w:p>
+            <w:r>
+              <w:t>ERP-01-VA-WORKSPACE</w:t>
+            </w:r>
+          </w:p>
+        </w:tc>
+        <w:tc>
+          <w:tcPr>
+            <w:tcW w:type="dxa" w:w="3206"/>
+          </w:tcPr>
+          <w:p>
+            <w:r>
+              <w:t>Current page primary content region below Header / beside resting rail</w:t>
+            </w:r>
+          </w:p>
+        </w:tc>
+        <w:tc>
+          <w:tcPr>
+            <w:tcW w:type="dxa" w:w="3206"/>
+          </w:tcPr>
+          <w:p>
+            <w:r>
+              <w:t>Use this Word's existing Primary Grid / section dimensions</w:t>
+            </w:r>
+          </w:p>
+        </w:tc>
+        <w:tc>
+          <w:tcPr>
+            <w:tcW w:type="dxa" w:w="3206"/>
+          </w:tcPr>
+          <w:p>
+            <w:r>
+              <w:t>Owns page-local section geometry; dialogs/drawers are overlays, not replacement layout</w:t>
+            </w:r>
+          </w:p>
+        </w:tc>
+        <w:tc>
+          <w:tcPr>
+            <w:tcW w:type="dxa" w:w="3206"/>
+          </w:tcPr>
+          <w:p>
+            <w:r>
+              <w:t>LOCKED_EXCEPT_AUTHORIZED_CHANGE_SET</w:t>
+            </w:r>
+          </w:p>
+        </w:tc>
+      </w:tr>
+    </w:tbl>
+    <w:p>
+      <w:pPr>
+        <w:pStyle w:val="Heading2"/>
+      </w:pPr>
+      <w:r>
+        <w:t>Visual Generation / Review Planning Contract</w:t>
+      </w:r>
+    </w:p>
+    <w:p>
+      <w:r>
+        <w:t>[ACPOS-DESIGN-CLOSURE:ERP-01:VISUAL-CONTRACT]</w:t>
+      </w:r>
+    </w:p>
+    <w:tbl>
+      <w:tblPr>
+        <w:tblStyle w:val="TableGrid"/>
+        <w:tblW w:type="auto" w:w="0"/>
+        <w:tblLook w:firstColumn="1" w:firstRow="1" w:lastColumn="0" w:lastRow="0" w:noHBand="0" w:noVBand="1" w:val="04A0"/>
+      </w:tblPr>
+      <w:tblGrid>
+        <w:gridCol w:w="8016"/>
+        <w:gridCol w:w="8016"/>
+      </w:tblGrid>
+      <w:tr>
+        <w:tc>
+          <w:tcPr>
+            <w:tcW w:type="dxa" w:w="8016"/>
+          </w:tcPr>
+          <w:p>
+            <w:r>
+              <w:t>Design Item / 設計項目</w:t>
+            </w:r>
+          </w:p>
+        </w:tc>
+        <w:tc>
+          <w:tcPr>
+            <w:tcW w:type="dxa" w:w="8016"/>
+          </w:tcPr>
+          <w:p>
+            <w:r>
+              <w:t>Canonical Planning Design Contract / 正式規劃設計契約</w:t>
+            </w:r>
+          </w:p>
+        </w:tc>
+      </w:tr>
+      <w:tr>
+        <w:tc>
+          <w:tcPr>
+            <w:tcW w:type="dxa" w:w="8016"/>
+          </w:tcPr>
+          <w:p>
+            <w:r>
+              <w:t>Current Canonical Visual</w:t>
+            </w:r>
+          </w:p>
+        </w:tc>
+        <w:tc>
+          <w:tcPr>
+            <w:tcW w:type="dxa" w:w="8016"/>
+          </w:tcPr>
+          <w:p>
+            <w:r>
+              <w:t>REFERENCE_ONLY → current visual/baseline already named in this Word or shared current visual owner. This annex does not replace it.</w:t>
+            </w:r>
+          </w:p>
+        </w:tc>
+      </w:tr>
+      <w:tr>
+        <w:tc>
+          <w:tcPr>
+            <w:tcW w:type="dxa" w:w="8016"/>
+          </w:tcPr>
+          <w:p>
+            <w:r>
+              <w:t>Visual Candidate UID</w:t>
+            </w:r>
+          </w:p>
+        </w:tc>
+        <w:tc>
+          <w:tcPr>
+            <w:tcW w:type="dxa" w:w="8016"/>
+          </w:tcPr>
+          <w:p>
+            <w:r>
+              <w:t>Generated candidate MUST receive a unique Visual UID and Parent Visual UID; no candidate is deemed approved merely by this annex.</w:t>
+            </w:r>
+          </w:p>
+        </w:tc>
+      </w:tr>
+      <w:tr>
+        <w:tc>
+          <w:tcPr>
+            <w:tcW w:type="dxa" w:w="8016"/>
+          </w:tcPr>
+          <w:p>
+            <w:r>
+              <w:t>Generation Manifest</w:t>
+            </w:r>
+          </w:p>
+        </w:tc>
+        <w:tc>
+          <w:tcPr>
+            <w:tcW w:type="dxa" w:w="8016"/>
+          </w:tcPr>
+          <w:p>
+            <w:r>
+              <w:t>Required before generation; MUST bind Page UID, Design Version, Reference Visual UID, Design System Version, Layout UID, Component Versions, Asset refs, Viewport, Language, Theme, Change Level/Set and locked/editable areas.</w:t>
+            </w:r>
+          </w:p>
+        </w:tc>
+      </w:tr>
+      <w:tr>
+        <w:tc>
+          <w:tcPr>
+            <w:tcW w:type="dxa" w:w="8016"/>
+          </w:tcPr>
+          <w:p>
+            <w:r>
+              <w:t>Visual Preview</w:t>
+            </w:r>
+          </w:p>
+        </w:tc>
+        <w:tc>
+          <w:tcPr>
+            <w:tcW w:type="dxa" w:w="8016"/>
+          </w:tcPr>
+          <w:p>
+            <w:r>
+              <w:t>MUST represent the actual website structure, not a moodboard. Preview occurs after page/design specification and before Design Freeze.</w:t>
+            </w:r>
+          </w:p>
+        </w:tc>
+      </w:tr>
+      <w:tr>
+        <w:tc>
+          <w:tcPr>
+            <w:tcW w:type="dxa" w:w="8016"/>
+          </w:tcPr>
+          <w:p>
+            <w:r>
+              <w:t>Visual Review</w:t>
+            </w:r>
+          </w:p>
+        </w:tc>
+        <w:tc>
+          <w:tcPr>
+            <w:tcW w:type="dxa" w:w="8016"/>
+          </w:tcPr>
+          <w:p>
+            <w:r>
+              <w:t>Authorized reviewer checks function-to-visual mapping, geometry, anchors, responsive order, A11y/i18n and visual drift.</w:t>
+            </w:r>
+          </w:p>
+        </w:tc>
+      </w:tr>
+      <w:tr>
+        <w:tc>
+          <w:tcPr>
+            <w:tcW w:type="dxa" w:w="8016"/>
+          </w:tcPr>
+          <w:p>
+            <w:r>
+              <w:t>Approval Status</w:t>
+            </w:r>
+          </w:p>
+        </w:tc>
+        <w:tc>
+          <w:tcPr>
+            <w:tcW w:type="dxa" w:w="8016"/>
+          </w:tcPr>
+          <w:p>
+            <w:r>
+              <w:t>VISUAL_APPROVED is required before DESIGN_FROZEN. This planning annex does NOT self-approve the page.</w:t>
+            </w:r>
+          </w:p>
+        </w:tc>
+      </w:tr>
+      <w:tr>
+        <w:tc>
+          <w:tcPr>
+            <w:tcW w:type="dxa" w:w="8016"/>
+          </w:tcPr>
+          <w:p>
+            <w:r>
+              <w:t>Change Set / Drift</w:t>
+            </w:r>
+          </w:p>
+        </w:tc>
+        <w:tc>
+          <w:tcPr>
+            <w:tcW w:type="dxa" w:w="8016"/>
+          </w:tcPr>
+          <w:p>
+            <w:r>
+              <w:t>Any layout/asset/typography/color/component/navigation/dimension/information-hierarchy change outside the approved Change Set is VISUAL_DRIFT_FAIL.</w:t>
             </w:r>
           </w:p>
         </w:tc>

</xml_diff>

<commit_message>
fix(acpos): complete asset applicability and binding contracts
</commit_message>
<xml_diff>
--- a/ACPOS_ERP-01_ERP與財務_Mother_Basic_Design_OPTIMIZED.docx
+++ b/ACPOS_ERP-01_ERP與財務_Mother_Basic_Design_OPTIMIZED.docx
@@ -30274,6 +30274,184 @@
           <w:p>
             <w:r>
               <w:t>Any layout/asset/typography/color/component/navigation/dimension/information-hierarchy change outside the approved Change Set is VISUAL_DRIFT_FAIL.</w:t>
+            </w:r>
+          </w:p>
+        </w:tc>
+      </w:tr>
+    </w:tbl>
+    <w:p>
+      <w:pPr>
+        <w:pStyle w:val="Heading2"/>
+      </w:pPr>
+      <w:r>
+        <w:t>Asset Registry / Binding Applicability Closure｜素材註冊與綁定補齊</w:t>
+      </w:r>
+    </w:p>
+    <w:p>
+      <w:r>
+        <w:t>[ACPOS-DESIGN-CLOSURE:ERP-01:ASSET]</w:t>
+      </w:r>
+    </w:p>
+    <w:tbl>
+      <w:tblPr>
+        <w:tblStyle w:val="TableGrid"/>
+        <w:tblW w:type="auto" w:w="0"/>
+        <w:tblLook w:firstColumn="1" w:firstRow="1" w:lastColumn="0" w:lastRow="0" w:noHBand="0" w:noVBand="1" w:val="04A0"/>
+      </w:tblPr>
+      <w:tblGrid>
+        <w:gridCol w:w="8016"/>
+        <w:gridCol w:w="8016"/>
+      </w:tblGrid>
+      <w:tr>
+        <w:tc>
+          <w:tcPr>
+            <w:tcW w:type="dxa" w:w="8016"/>
+          </w:tcPr>
+          <w:p>
+            <w:r>
+              <w:t>Design Item / 設計項目</w:t>
+            </w:r>
+          </w:p>
+        </w:tc>
+        <w:tc>
+          <w:tcPr>
+            <w:tcW w:type="dxa" w:w="8016"/>
+          </w:tcPr>
+          <w:p>
+            <w:r>
+              <w:t>Canonical Planning Design Contract / 正式規劃設計契約</w:t>
+            </w:r>
+          </w:p>
+        </w:tc>
+      </w:tr>
+      <w:tr>
+        <w:tc>
+          <w:tcPr>
+            <w:tcW w:type="dxa" w:w="8016"/>
+          </w:tcPr>
+          <w:p>
+            <w:r>
+              <w:t>Page-local Asset Registry Applicability</w:t>
+            </w:r>
+          </w:p>
+        </w:tc>
+        <w:tc>
+          <w:tcPr>
+            <w:tcW w:type="dxa" w:w="8016"/>
+          </w:tcPr>
+          <w:p>
+            <w:r>
+              <w:t>REFERENCE_ONLY / CONDITIONAL. Existing page-owned formal Asset UID rows, if present, remain authoritative; this annex creates no duplicate Asset UID.</w:t>
+            </w:r>
+          </w:p>
+        </w:tc>
+      </w:tr>
+      <w:tr>
+        <w:tc>
+          <w:tcPr>
+            <w:tcW w:type="dxa" w:w="8016"/>
+          </w:tcPr>
+          <w:p>
+            <w:r>
+              <w:t>Shared Shell Assets</w:t>
+            </w:r>
+          </w:p>
+        </w:tc>
+        <w:tc>
+          <w:tcPr>
+            <w:tcW w:type="dxa" w:w="8016"/>
+          </w:tcPr>
+          <w:p>
+            <w:r>
+              <w:t>SHARED_OWNER_REFERENCE → Global Home / Design System owns logo, navigation icons, generic status icons and shared shell visuals; page MUST NOT clone them.</w:t>
+            </w:r>
+          </w:p>
+        </w:tc>
+      </w:tr>
+      <w:tr>
+        <w:tc>
+          <w:tcPr>
+            <w:tcW w:type="dxa" w:w="8016"/>
+          </w:tcPr>
+          <w:p>
+            <w:r>
+              <w:t>Dynamic Business Content</w:t>
+            </w:r>
+          </w:p>
+        </w:tc>
+        <w:tc>
+          <w:tcPr>
+            <w:tcW w:type="dxa" w:w="8016"/>
+          </w:tcPr>
+          <w:p>
+            <w:r>
+              <w:t>Provider logos, thumbnails, output previews, evidence images or other runtime/business data are NOT automatically design assets; they remain data/projection unless current page explicitly registers an Asset UID.</w:t>
+            </w:r>
+          </w:p>
+        </w:tc>
+      </w:tr>
+      <w:tr>
+        <w:tc>
+          <w:tcPr>
+            <w:tcW w:type="dxa" w:w="8016"/>
+          </w:tcPr>
+          <w:p>
+            <w:r>
+              <w:t>Binding Contract</w:t>
+            </w:r>
+          </w:p>
+        </w:tc>
+        <w:tc>
+          <w:tcPr>
+            <w:tcW w:type="dxa" w:w="8016"/>
+          </w:tcPr>
+          <w:p>
+            <w:r>
+              <w:t>Any formal page-owned asset MUST bind Page UID + Section UID + Component UID + Asset UID + position + width/height + aspect ratio + crop/object-fit/object-position + lock status.</w:t>
+            </w:r>
+          </w:p>
+        </w:tc>
+      </w:tr>
+      <w:tr>
+        <w:tc>
+          <w:tcPr>
+            <w:tcW w:type="dxa" w:w="8016"/>
+          </w:tcPr>
+          <w:p>
+            <w:r>
+              <w:t>Modification Rule</w:t>
+            </w:r>
+          </w:p>
+        </w:tc>
+        <w:tc>
+          <w:tcPr>
+            <w:tcW w:type="dxa" w:w="8016"/>
+          </w:tcPr>
+          <w:p>
+            <w:r>
+              <w:t>APPROVED/LOCKED assets may not be regenerated, recolored, cropped or repurposed without an authorized Change Set and Visual Review.</w:t>
+            </w:r>
+          </w:p>
+        </w:tc>
+      </w:tr>
+      <w:tr>
+        <w:tc>
+          <w:tcPr>
+            <w:tcW w:type="dxa" w:w="8016"/>
+          </w:tcPr>
+          <w:p>
+            <w:r>
+              <w:t>N/A Authority</w:t>
+            </w:r>
+          </w:p>
+        </w:tc>
+        <w:tc>
+          <w:tcPr>
+            <w:tcW w:type="dxa" w:w="8016"/>
+          </w:tcPr>
+          <w:p>
+            <w:r>
+              <w:t>When a page has no page-owned formal visual asset, page-local Asset Binding is NOT_APPLICABLE with this reason; shared assets remain referenced from their existing canonical owner.</w:t>
             </w:r>
           </w:p>
         </w:tc>

</xml_diff>

<commit_message>
fix(acpos): complete design audit acceptance and DoD contracts
</commit_message>
<xml_diff>
--- a/ACPOS_ERP-01_ERP與財務_Mother_Basic_Design_OPTIMIZED.docx
+++ b/ACPOS_ERP-01_ERP與財務_Mother_Basic_Design_OPTIMIZED.docx
@@ -30452,6 +30452,294 @@
           <w:p>
             <w:r>
               <w:t>When a page has no page-owned formal visual asset, page-local Asset Binding is NOT_APPLICABLE with this reason; shared assets remain referenced from their existing canonical owner.</w:t>
+            </w:r>
+          </w:p>
+        </w:tc>
+      </w:tr>
+    </w:tbl>
+    <w:p>
+      <w:pPr>
+        <w:pStyle w:val="Heading2"/>
+      </w:pPr>
+      <w:r>
+        <w:t>Audit Baseline / Acceptance Matrix / Definition of Done Closure</w:t>
+      </w:r>
+    </w:p>
+    <w:p>
+      <w:r>
+        <w:t>[ACPOS-DESIGN-CLOSURE:ERP-01:AUDIT]</w:t>
+      </w:r>
+    </w:p>
+    <w:tbl>
+      <w:tblPr>
+        <w:tblStyle w:val="TableGrid"/>
+        <w:tblW w:type="auto" w:w="0"/>
+        <w:tblLook w:firstColumn="1" w:firstRow="1" w:lastColumn="0" w:lastRow="0" w:noHBand="0" w:noVBand="1" w:val="04A0"/>
+      </w:tblPr>
+      <w:tblGrid>
+        <w:gridCol w:w="8016"/>
+        <w:gridCol w:w="8016"/>
+      </w:tblGrid>
+      <w:tr>
+        <w:tc>
+          <w:tcPr>
+            <w:tcW w:type="dxa" w:w="8016"/>
+          </w:tcPr>
+          <w:p>
+            <w:r>
+              <w:t>Design Item / 設計項目</w:t>
+            </w:r>
+          </w:p>
+        </w:tc>
+        <w:tc>
+          <w:tcPr>
+            <w:tcW w:type="dxa" w:w="8016"/>
+          </w:tcPr>
+          <w:p>
+            <w:r>
+              <w:t>Canonical Planning Design Contract / 正式規劃設計契約</w:t>
+            </w:r>
+          </w:p>
+        </w:tc>
+      </w:tr>
+      <w:tr>
+        <w:tc>
+          <w:tcPr>
+            <w:tcW w:type="dxa" w:w="8016"/>
+          </w:tcPr>
+          <w:p>
+            <w:r>
+              <w:t>Audit UID</w:t>
+            </w:r>
+          </w:p>
+        </w:tc>
+        <w:tc>
+          <w:tcPr>
+            <w:tcW w:type="dxa" w:w="8016"/>
+          </w:tcPr>
+          <w:p>
+            <w:r>
+              <w:t>ERP-01-AUD-DESIGN-001</w:t>
+            </w:r>
+          </w:p>
+        </w:tc>
+      </w:tr>
+      <w:tr>
+        <w:tc>
+          <w:tcPr>
+            <w:tcW w:type="dxa" w:w="8016"/>
+          </w:tcPr>
+          <w:p>
+            <w:r>
+              <w:t>Target UID</w:t>
+            </w:r>
+          </w:p>
+        </w:tc>
+        <w:tc>
+          <w:tcPr>
+            <w:tcW w:type="dxa" w:w="8016"/>
+          </w:tcPr>
+          <w:p>
+            <w:r>
+              <w:t>ERP-01</w:t>
+            </w:r>
+          </w:p>
+        </w:tc>
+      </w:tr>
+      <w:tr>
+        <w:tc>
+          <w:tcPr>
+            <w:tcW w:type="dxa" w:w="8016"/>
+          </w:tcPr>
+          <w:p>
+            <w:r>
+              <w:t>Required Audit Items</w:t>
+            </w:r>
+          </w:p>
+        </w:tc>
+        <w:tc>
+          <w:tcPr>
+            <w:tcW w:type="dxa" w:w="8016"/>
+          </w:tcPr>
+          <w:p>
+            <w:r>
+              <w:t>Requirement/Page identity where applicable; Architecture/Flow; Control/Field; Entity/Operation applicability; Cross-page/topology; Geometry; Visual Anchor/Preview contract; A11y/i18n; Asset applicability; Design Freeze package.</w:t>
+            </w:r>
+          </w:p>
+        </w:tc>
+      </w:tr>
+      <w:tr>
+        <w:tc>
+          <w:tcPr>
+            <w:tcW w:type="dxa" w:w="8016"/>
+          </w:tcPr>
+          <w:p>
+            <w:r>
+              <w:t>Required Tests</w:t>
+            </w:r>
+          </w:p>
+        </w:tc>
+        <w:tc>
+          <w:tcPr>
+            <w:tcW w:type="dxa" w:w="8016"/>
+          </w:tcPr>
+          <w:p>
+            <w:r>
+              <w:t>Word structural completeness audit; forward/reverse design-reference audit; DOCX render visual QA; design-only semantic consistency audit.</w:t>
+            </w:r>
+          </w:p>
+        </w:tc>
+      </w:tr>
+      <w:tr>
+        <w:tc>
+          <w:tcPr>
+            <w:tcW w:type="dxa" w:w="8016"/>
+          </w:tcPr>
+          <w:p>
+            <w:r>
+              <w:t>Required Evidence</w:t>
+            </w:r>
+          </w:p>
+        </w:tc>
+        <w:tc>
+          <w:tcPr>
+            <w:tcW w:type="dxa" w:w="8016"/>
+          </w:tcPr>
+          <w:p>
+            <w:r>
+              <w:t>Exact Word hash/tree identity; audit result; render page set; visual-review record when a candidate is generated.</w:t>
+            </w:r>
+          </w:p>
+        </w:tc>
+      </w:tr>
+      <w:tr>
+        <w:tc>
+          <w:tcPr>
+            <w:tcW w:type="dxa" w:w="8016"/>
+          </w:tcPr>
+          <w:p>
+            <w:r>
+              <w:t>Required Gates</w:t>
+            </w:r>
+          </w:p>
+        </w:tc>
+        <w:tc>
+          <w:tcPr>
+            <w:tcW w:type="dxa" w:w="8016"/>
+          </w:tcPr>
+          <w:p>
+            <w:r>
+              <w:t>Requirement, Naming, Architecture, Navigation, User Flow, Page Registry, Design System, Layout, Component, Asset applicability/binding, Page Design, Visual Preview/Review/Approval, Audit Baseline, Acceptance Matrix, DoD.</w:t>
+            </w:r>
+          </w:p>
+        </w:tc>
+      </w:tr>
+      <w:tr>
+        <w:tc>
+          <w:tcPr>
+            <w:tcW w:type="dxa" w:w="8016"/>
+          </w:tcPr>
+          <w:p>
+            <w:r>
+              <w:t>Acceptance Matrix</w:t>
+            </w:r>
+          </w:p>
+        </w:tc>
+        <w:tc>
+          <w:tcPr>
+            <w:tcW w:type="dxa" w:w="8016"/>
+          </w:tcPr>
+          <w:p>
+            <w:r>
+              <w:t>Every item is classified REQUIRED / OPTIONAL / NOT_APPLICABLE with owner/evidence. REQUIRED may not be downgraded merely to obtain PASS.</w:t>
+            </w:r>
+          </w:p>
+        </w:tc>
+      </w:tr>
+      <w:tr>
+        <w:tc>
+          <w:tcPr>
+            <w:tcW w:type="dxa" w:w="8016"/>
+          </w:tcPr>
+          <w:p>
+            <w:r>
+              <w:t>PASS Condition</w:t>
+            </w:r>
+          </w:p>
+        </w:tc>
+        <w:tc>
+          <w:tcPr>
+            <w:tcW w:type="dxa" w:w="8016"/>
+          </w:tcPr>
+          <w:p>
+            <w:r>
+              <w:t>All applicable REQUIRED planning/basic-design items are complete and internally consistent; no unresolved duplicate owner/reference or required design gap.</w:t>
+            </w:r>
+          </w:p>
+        </w:tc>
+      </w:tr>
+      <w:tr>
+        <w:tc>
+          <w:tcPr>
+            <w:tcW w:type="dxa" w:w="8016"/>
+          </w:tcPr>
+          <w:p>
+            <w:r>
+              <w:t>PARTIAL Condition</w:t>
+            </w:r>
+          </w:p>
+        </w:tc>
+        <w:tc>
+          <w:tcPr>
+            <w:tcW w:type="dxa" w:w="8016"/>
+          </w:tcPr>
+          <w:p>
+            <w:r>
+              <w:t>Only explicitly OPTIONAL or justified NOT_APPLICABLE design items remain; no REQUIRED item is missing.</w:t>
+            </w:r>
+          </w:p>
+        </w:tc>
+      </w:tr>
+      <w:tr>
+        <w:tc>
+          <w:tcPr>
+            <w:tcW w:type="dxa" w:w="8016"/>
+          </w:tcPr>
+          <w:p>
+            <w:r>
+              <w:t>FAIL Condition</w:t>
+            </w:r>
+          </w:p>
+        </w:tc>
+        <w:tc>
+          <w:tcPr>
+            <w:tcW w:type="dxa" w:w="8016"/>
+          </w:tcPr>
+          <w:p>
+            <w:r>
+              <w:t>Any REQUIRED planning/design contract, owner/reference, geometry, topology, acceptance condition or visual prerequisite is unresolved or contradictory.</w:t>
+            </w:r>
+          </w:p>
+        </w:tc>
+      </w:tr>
+      <w:tr>
+        <w:tc>
+          <w:tcPr>
+            <w:tcW w:type="dxa" w:w="8016"/>
+          </w:tcPr>
+          <w:p>
+            <w:r>
+              <w:t>Definition of Done</w:t>
+            </w:r>
+          </w:p>
+        </w:tc>
+        <w:tc>
+          <w:tcPr>
+            <w:tcW w:type="dxa" w:w="8016"/>
+          </w:tcPr>
+          <w:p>
+            <w:r>
+              <w:t>Current Word is self-contained enough for authorized construction handoff, while unresolved product choices remain explicitly blocked rather than invented.</w:t>
             </w:r>
           </w:p>
         </w:tc>

</xml_diff>

<commit_message>
fix(acpos): complete design freeze package contracts
</commit_message>
<xml_diff>
--- a/ACPOS_ERP-01_ERP與財務_Mother_Basic_Design_OPTIMIZED.docx
+++ b/ACPOS_ERP-01_ERP與財務_Mother_Basic_Design_OPTIMIZED.docx
@@ -30740,6 +30740,404 @@
           <w:p>
             <w:r>
               <w:t>Current Word is self-contained enough for authorized construction handoff, while unresolved product choices remain explicitly blocked rather than invented.</w:t>
+            </w:r>
+          </w:p>
+        </w:tc>
+      </w:tr>
+    </w:tbl>
+    <w:p>
+      <w:pPr>
+        <w:pStyle w:val="Heading2"/>
+      </w:pPr>
+      <w:r>
+        <w:t>Design Freeze Package Closure｜設計封板包補齊</w:t>
+      </w:r>
+    </w:p>
+    <w:p>
+      <w:r>
+        <w:t>[ACPOS-DESIGN-CLOSURE:ERP-01:FREEZE]</w:t>
+      </w:r>
+    </w:p>
+    <w:tbl>
+      <w:tblPr>
+        <w:tblStyle w:val="TableGrid"/>
+        <w:tblW w:type="auto" w:w="0"/>
+        <w:tblLook w:firstColumn="1" w:firstRow="1" w:lastColumn="0" w:lastRow="0" w:noHBand="0" w:noVBand="1" w:val="04A0"/>
+      </w:tblPr>
+      <w:tblGrid>
+        <w:gridCol w:w="8016"/>
+        <w:gridCol w:w="8016"/>
+      </w:tblGrid>
+      <w:tr>
+        <w:tc>
+          <w:tcPr>
+            <w:tcW w:type="dxa" w:w="8016"/>
+          </w:tcPr>
+          <w:p>
+            <w:r>
+              <w:t>Design Item / 設計項目</w:t>
+            </w:r>
+          </w:p>
+        </w:tc>
+        <w:tc>
+          <w:tcPr>
+            <w:tcW w:type="dxa" w:w="8016"/>
+          </w:tcPr>
+          <w:p>
+            <w:r>
+              <w:t>Canonical Planning Design Contract / 正式規劃設計契約</w:t>
+            </w:r>
+          </w:p>
+        </w:tc>
+      </w:tr>
+      <w:tr>
+        <w:tc>
+          <w:tcPr>
+            <w:tcW w:type="dxa" w:w="8016"/>
+          </w:tcPr>
+          <w:p>
+            <w:r>
+              <w:t>Canonical UID</w:t>
+            </w:r>
+          </w:p>
+        </w:tc>
+        <w:tc>
+          <w:tcPr>
+            <w:tcW w:type="dxa" w:w="8016"/>
+          </w:tcPr>
+          <w:p>
+            <w:r>
+              <w:t>ERP-01</w:t>
+            </w:r>
+          </w:p>
+        </w:tc>
+      </w:tr>
+      <w:tr>
+        <w:tc>
+          <w:tcPr>
+            <w:tcW w:type="dxa" w:w="8016"/>
+          </w:tcPr>
+          <w:p>
+            <w:r>
+              <w:t>Canonical Name</w:t>
+            </w:r>
+          </w:p>
+        </w:tc>
+        <w:tc>
+          <w:tcPr>
+            <w:tcW w:type="dxa" w:w="8016"/>
+          </w:tcPr>
+          <w:p>
+            <w:r>
+              <w:t>ERP-01</w:t>
+            </w:r>
+          </w:p>
+        </w:tc>
+      </w:tr>
+      <w:tr>
+        <w:tc>
+          <w:tcPr>
+            <w:tcW w:type="dxa" w:w="8016"/>
+          </w:tcPr>
+          <w:p>
+            <w:r>
+              <w:t>Owner File</w:t>
+            </w:r>
+          </w:p>
+        </w:tc>
+        <w:tc>
+          <w:tcPr>
+            <w:tcW w:type="dxa" w:w="8016"/>
+          </w:tcPr>
+          <w:p>
+            <w:r>
+              <w:t>ACPOS_ERP-01_ERP與財務_Mother_Basic_Design_OPTIMIZED.docx</w:t>
+            </w:r>
+          </w:p>
+        </w:tc>
+      </w:tr>
+      <w:tr>
+        <w:tc>
+          <w:tcPr>
+            <w:tcW w:type="dxa" w:w="8016"/>
+          </w:tcPr>
+          <w:p>
+            <w:r>
+              <w:t>Page / Capability Spec</w:t>
+            </w:r>
+          </w:p>
+        </w:tc>
+        <w:tc>
+          <w:tcPr>
+            <w:tcW w:type="dxa" w:w="8016"/>
+          </w:tcPr>
+          <w:p>
+            <w:r>
+              <w:t>This current Word remains the single page design Canonical Owner.</w:t>
+            </w:r>
+          </w:p>
+        </w:tc>
+      </w:tr>
+      <w:tr>
+        <w:tc>
+          <w:tcPr>
+            <w:tcW w:type="dxa" w:w="8016"/>
+          </w:tcPr>
+          <w:p>
+            <w:r>
+              <w:t>Layout Mapping</w:t>
+            </w:r>
+          </w:p>
+        </w:tc>
+        <w:tc>
+          <w:tcPr>
+            <w:tcW w:type="dxa" w:w="8016"/>
+          </w:tcPr>
+          <w:p>
+            <w:r>
+              <w:t>REFERENCE → existing Page Layout / Primary Grid / Section mapping + Design System/Layout closure annex.</w:t>
+            </w:r>
+          </w:p>
+        </w:tc>
+      </w:tr>
+      <w:tr>
+        <w:tc>
+          <w:tcPr>
+            <w:tcW w:type="dxa" w:w="8016"/>
+          </w:tcPr>
+          <w:p>
+            <w:r>
+              <w:t>Component Mapping</w:t>
+            </w:r>
+          </w:p>
+        </w:tc>
+        <w:tc>
+          <w:tcPr>
+            <w:tcW w:type="dxa" w:w="8016"/>
+          </w:tcPr>
+          <w:p>
+            <w:r>
+              <w:t>REFERENCE → current Component/Section registry in this Word; no duplicate component inventory is introduced.</w:t>
+            </w:r>
+          </w:p>
+        </w:tc>
+      </w:tr>
+      <w:tr>
+        <w:tc>
+          <w:tcPr>
+            <w:tcW w:type="dxa" w:w="8016"/>
+          </w:tcPr>
+          <w:p>
+            <w:r>
+              <w:t>Control / Field Mapping</w:t>
+            </w:r>
+          </w:p>
+        </w:tc>
+        <w:tc>
+          <w:tcPr>
+            <w:tcW w:type="dxa" w:w="8016"/>
+          </w:tcPr>
+          <w:p>
+            <w:r>
+              <w:t>REFERENCE → current Control / Field / Action / Permission design tables and invariants in this Word.</w:t>
+            </w:r>
+          </w:p>
+        </w:tc>
+      </w:tr>
+      <w:tr>
+        <w:tc>
+          <w:tcPr>
+            <w:tcW w:type="dxa" w:w="8016"/>
+          </w:tcPr>
+          <w:p>
+            <w:r>
+              <w:t>Asset Mapping</w:t>
+            </w:r>
+          </w:p>
+        </w:tc>
+        <w:tc>
+          <w:tcPr>
+            <w:tcW w:type="dxa" w:w="8016"/>
+          </w:tcPr>
+          <w:p>
+            <w:r>
+              <w:t>REFERENCE → current page Asset Registry if any; otherwise explicit shared-owner / NOT_APPLICABLE asset rule in this annex.</w:t>
+            </w:r>
+          </w:p>
+        </w:tc>
+      </w:tr>
+      <w:tr>
+        <w:tc>
+          <w:tcPr>
+            <w:tcW w:type="dxa" w:w="8016"/>
+          </w:tcPr>
+          <w:p>
+            <w:r>
+              <w:t>Responsive Spec</w:t>
+            </w:r>
+          </w:p>
+        </w:tc>
+        <w:tc>
+          <w:tcPr>
+            <w:tcW w:type="dxa" w:w="8016"/>
+          </w:tcPr>
+          <w:p>
+            <w:r>
+              <w:t>REFERENCE → current page responsive rules + Visual Geometry closure annex.</w:t>
+            </w:r>
+          </w:p>
+        </w:tc>
+      </w:tr>
+      <w:tr>
+        <w:tc>
+          <w:tcPr>
+            <w:tcW w:type="dxa" w:w="8016"/>
+          </w:tcPr>
+          <w:p>
+            <w:r>
+              <w:t>Current Canonical Visual</w:t>
+            </w:r>
+          </w:p>
+        </w:tc>
+        <w:tc>
+          <w:tcPr>
+            <w:tcW w:type="dxa" w:w="8016"/>
+          </w:tcPr>
+          <w:p>
+            <w:r>
+              <w:t>REFERENCE → current visual/baseline already owned by this page/shared visual authority; candidate does not replace it without approval.</w:t>
+            </w:r>
+          </w:p>
+        </w:tc>
+      </w:tr>
+      <w:tr>
+        <w:tc>
+          <w:tcPr>
+            <w:tcW w:type="dxa" w:w="8016"/>
+          </w:tcPr>
+          <w:p>
+            <w:r>
+              <w:t>Generation Manifest</w:t>
+            </w:r>
+          </w:p>
+        </w:tc>
+        <w:tc>
+          <w:tcPr>
+            <w:tcW w:type="dxa" w:w="8016"/>
+          </w:tcPr>
+          <w:p>
+            <w:r>
+              <w:t>REQUIRED before a new candidate is generated; fields are defined by the Visual contract in this annex.</w:t>
+            </w:r>
+          </w:p>
+        </w:tc>
+      </w:tr>
+      <w:tr>
+        <w:tc>
+          <w:tcPr>
+            <w:tcW w:type="dxa" w:w="8016"/>
+          </w:tcPr>
+          <w:p>
+            <w:r>
+              <w:t>Audit Baseline</w:t>
+            </w:r>
+          </w:p>
+        </w:tc>
+        <w:tc>
+          <w:tcPr>
+            <w:tcW w:type="dxa" w:w="8016"/>
+          </w:tcPr>
+          <w:p>
+            <w:r>
+              <w:t>REFERENCE → ERP-01-AUD-DESIGN-001</w:t>
+            </w:r>
+          </w:p>
+        </w:tc>
+      </w:tr>
+      <w:tr>
+        <w:tc>
+          <w:tcPr>
+            <w:tcW w:type="dxa" w:w="8016"/>
+          </w:tcPr>
+          <w:p>
+            <w:r>
+              <w:t>Acceptance Matrix</w:t>
+            </w:r>
+          </w:p>
+        </w:tc>
+        <w:tc>
+          <w:tcPr>
+            <w:tcW w:type="dxa" w:w="8016"/>
+          </w:tcPr>
+          <w:p>
+            <w:r>
+              <w:t>Current page acceptance section plus this annex; REQUIRED / OPTIONAL / NOT_APPLICABLE classification is preserved.</w:t>
+            </w:r>
+          </w:p>
+        </w:tc>
+      </w:tr>
+      <w:tr>
+        <w:tc>
+          <w:tcPr>
+            <w:tcW w:type="dxa" w:w="8016"/>
+          </w:tcPr>
+          <w:p>
+            <w:r>
+              <w:t>Definition of Done</w:t>
+            </w:r>
+          </w:p>
+        </w:tc>
+        <w:tc>
+          <w:tcPr>
+            <w:tcW w:type="dxa" w:w="8016"/>
+          </w:tcPr>
+          <w:p>
+            <w:r>
+              <w:t>Planning/basic-design DoD is the current page DoD plus zero unresolved REQUIRED design-spec gaps.</w:t>
+            </w:r>
+          </w:p>
+        </w:tc>
+      </w:tr>
+      <w:tr>
+        <w:tc>
+          <w:tcPr>
+            <w:tcW w:type="dxa" w:w="8016"/>
+          </w:tcPr>
+          <w:p>
+            <w:r>
+              <w:t>Design Version</w:t>
+            </w:r>
+          </w:p>
+        </w:tc>
+        <w:tc>
+          <w:tcPr>
+            <w:tcW w:type="dxa" w:w="8016"/>
+          </w:tcPr>
+          <w:p>
+            <w:r>
+              <w:t>Use this Word's current version metadata / exact repository revision; this annex MUST NOT invent a parallel design version.</w:t>
+            </w:r>
+          </w:p>
+        </w:tc>
+      </w:tr>
+      <w:tr>
+        <w:tc>
+          <w:tcPr>
+            <w:tcW w:type="dxa" w:w="8016"/>
+          </w:tcPr>
+          <w:p>
+            <w:r>
+              <w:t>Freeze Status</w:t>
+            </w:r>
+          </w:p>
+        </w:tc>
+        <w:tc>
+          <w:tcPr>
+            <w:tcW w:type="dxa" w:w="8016"/>
+          </w:tcPr>
+          <w:p>
+            <w:r>
+              <w:t>DESIGN_FREEZE_PACKAGE_DEFINED. DESIGN_FROZEN may be asserted only after required Visual Preview/Review/Approval and all applicable design gates actually pass; this annex does not self-approve.</w:t>
             </w:r>
           </w:p>
         </w:tc>

</xml_diff>